<commit_message>
Packet tracer word file
</commit_message>
<xml_diff>
--- a/RESEAU_LOCAL_ET_SECURITE/Cours10/420-2C5-JR_10_Masques réseaux.docx
+++ b/RESEAU_LOCAL_ET_SECURITE/Cours10/420-2C5-JR_10_Masques réseaux.docx
@@ -10135,19 +10135,7 @@
           <w:rPr>
             <w:rStyle w:val="Lienhypertexte"/>
           </w:rPr>
-          <w:t>https://en.wikipedia.org/wiki/R</w:t>
-        </w:r>
-        <w:r>
-          <w:rPr>
-            <w:rStyle w:val="Lienhypertexte"/>
-          </w:rPr>
-          <w:t>e</w:t>
-        </w:r>
-        <w:r>
-          <w:rPr>
-            <w:rStyle w:val="Lienhypertexte"/>
-          </w:rPr>
-          <w:t>served_IP_addresses</w:t>
+          <w:t>https://en.wikipedia.org/wiki/Reserved_IP_addresses</w:t>
         </w:r>
       </w:hyperlink>
       <w:r>
@@ -10276,19 +10264,7 @@
           <w:rPr>
             <w:rStyle w:val="Lienhypertexte"/>
           </w:rPr>
-          <w:t>https://iploca</w:t>
-        </w:r>
-        <w:r>
-          <w:rPr>
-            <w:rStyle w:val="Lienhypertexte"/>
-          </w:rPr>
-          <w:t>t</w:t>
-        </w:r>
-        <w:r>
-          <w:rPr>
-            <w:rStyle w:val="Lienhypertexte"/>
-          </w:rPr>
-          <w:t>ion.io/</w:t>
+          <w:t>https://iplocation.io/</w:t>
         </w:r>
       </w:hyperlink>
     </w:p>
@@ -17598,6 +17574,36 @@
               <w:pStyle w:val="Code"/>
               <w:cnfStyle w:val="000000000000" w:firstRow="0" w:lastRow="0" w:firstColumn="0" w:lastColumn="0" w:oddVBand="0" w:evenVBand="0" w:oddHBand="0" w:evenHBand="0" w:firstRowFirstColumn="0" w:firstRowLastColumn="0" w:lastRowFirstColumn="0" w:lastRowLastColumn="0"/>
             </w:pPr>
+            <w:r>
+              <w:t>115 PC</w:t>
+            </w:r>
+          </w:p>
+          <w:p>
+            <w:pPr>
+              <w:pStyle w:val="Code"/>
+              <w:cnfStyle w:val="000000000000" w:firstRow="0" w:lastRow="0" w:firstColumn="0" w:lastColumn="0" w:oddVBand="0" w:evenVBand="0" w:oddHBand="0" w:evenHBand="0" w:firstRowFirstColumn="0" w:firstRowLastColumn="0" w:lastRowFirstColumn="0" w:lastRowLastColumn="0"/>
+            </w:pPr>
+            <w:r>
+              <w:t>21 PC</w:t>
+            </w:r>
+          </w:p>
+          <w:p>
+            <w:pPr>
+              <w:pStyle w:val="Code"/>
+              <w:cnfStyle w:val="000000000000" w:firstRow="0" w:lastRow="0" w:firstColumn="0" w:lastColumn="0" w:oddVBand="0" w:evenVBand="0" w:oddHBand="0" w:evenHBand="0" w:firstRowFirstColumn="0" w:firstRowLastColumn="0" w:lastRowFirstColumn="0" w:lastRowLastColumn="0"/>
+            </w:pPr>
+            <w:r>
+              <w:t xml:space="preserve"> 7 PC</w:t>
+            </w:r>
+          </w:p>
+          <w:p>
+            <w:pPr>
+              <w:pStyle w:val="Code"/>
+              <w:cnfStyle w:val="000000000000" w:firstRow="0" w:lastRow="0" w:firstColumn="0" w:lastColumn="0" w:oddVBand="0" w:evenVBand="0" w:oddHBand="0" w:evenHBand="0" w:firstRowFirstColumn="0" w:firstRowLastColumn="0" w:lastRowFirstColumn="0" w:lastRowLastColumn="0"/>
+            </w:pPr>
+            <w:r>
+              <w:t xml:space="preserve"> 5 PC</w:t>
+            </w:r>
           </w:p>
         </w:tc>
       </w:tr>
@@ -17630,6 +17636,36 @@
               <w:pStyle w:val="Code"/>
               <w:cnfStyle w:val="000000100000" w:firstRow="0" w:lastRow="0" w:firstColumn="0" w:lastColumn="0" w:oddVBand="0" w:evenVBand="0" w:oddHBand="1" w:evenHBand="0" w:firstRowFirstColumn="0" w:firstRowLastColumn="0" w:lastRowFirstColumn="0" w:lastRowLastColumn="0"/>
             </w:pPr>
+            <w:r>
+              <w:t>117 = PC+Reseau+Brodacoast = 128</w:t>
+            </w:r>
+          </w:p>
+          <w:p>
+            <w:pPr>
+              <w:pStyle w:val="Code"/>
+              <w:cnfStyle w:val="000000100000" w:firstRow="0" w:lastRow="0" w:firstColumn="0" w:lastColumn="0" w:oddVBand="0" w:evenVBand="0" w:oddHBand="1" w:evenHBand="0" w:firstRowFirstColumn="0" w:firstRowLastColumn="0" w:lastRowFirstColumn="0" w:lastRowLastColumn="0"/>
+            </w:pPr>
+            <w:r>
+              <w:t>23 = 32</w:t>
+            </w:r>
+          </w:p>
+          <w:p>
+            <w:pPr>
+              <w:pStyle w:val="Code"/>
+              <w:cnfStyle w:val="000000100000" w:firstRow="0" w:lastRow="0" w:firstColumn="0" w:lastColumn="0" w:oddVBand="0" w:evenVBand="0" w:oddHBand="1" w:evenHBand="0" w:firstRowFirstColumn="0" w:firstRowLastColumn="0" w:lastRowFirstColumn="0" w:lastRowLastColumn="0"/>
+            </w:pPr>
+            <w:r>
+              <w:t>9 = 16</w:t>
+            </w:r>
+          </w:p>
+          <w:p>
+            <w:pPr>
+              <w:pStyle w:val="Code"/>
+              <w:cnfStyle w:val="000000100000" w:firstRow="0" w:lastRow="0" w:firstColumn="0" w:lastColumn="0" w:oddVBand="0" w:evenVBand="0" w:oddHBand="1" w:evenHBand="0" w:firstRowFirstColumn="0" w:firstRowLastColumn="0" w:lastRowFirstColumn="0" w:lastRowLastColumn="0"/>
+            </w:pPr>
+            <w:r>
+              <w:t>7 = 8</w:t>
+            </w:r>
           </w:p>
         </w:tc>
       </w:tr>
@@ -17657,6 +17693,42 @@
             <w:shd w:val="clear" w:color="auto" w:fill="FFFF00"/>
             <w:vAlign w:val="center"/>
           </w:tcPr>
+          <w:p>
+            <w:pPr>
+              <w:pStyle w:val="Code"/>
+              <w:cnfStyle w:val="000000000000" w:firstRow="0" w:lastRow="0" w:firstColumn="0" w:lastColumn="0" w:oddVBand="0" w:evenVBand="0" w:oddHBand="0" w:evenHBand="0" w:firstRowFirstColumn="0" w:firstRowLastColumn="0" w:lastRowFirstColumn="0" w:lastRowLastColumn="0"/>
+            </w:pPr>
+            <w:r>
+              <w:t>1 bits = /24 + 1 = /25</w:t>
+            </w:r>
+          </w:p>
+          <w:p>
+            <w:pPr>
+              <w:pStyle w:val="Code"/>
+              <w:cnfStyle w:val="000000000000" w:firstRow="0" w:lastRow="0" w:firstColumn="0" w:lastColumn="0" w:oddVBand="0" w:evenVBand="0" w:oddHBand="0" w:evenHBand="0" w:firstRowFirstColumn="0" w:firstRowLastColumn="0" w:lastRowFirstColumn="0" w:lastRowLastColumn="0"/>
+            </w:pPr>
+            <w:r>
+              <w:t>3 bits = /24 + 3 = /27</w:t>
+            </w:r>
+          </w:p>
+          <w:p>
+            <w:pPr>
+              <w:pStyle w:val="Code"/>
+              <w:cnfStyle w:val="000000000000" w:firstRow="0" w:lastRow="0" w:firstColumn="0" w:lastColumn="0" w:oddVBand="0" w:evenVBand="0" w:oddHBand="0" w:evenHBand="0" w:firstRowFirstColumn="0" w:firstRowLastColumn="0" w:lastRowFirstColumn="0" w:lastRowLastColumn="0"/>
+            </w:pPr>
+            <w:r>
+              <w:t>4 bits = /24 + 4 = /28</w:t>
+            </w:r>
+          </w:p>
+          <w:p>
+            <w:pPr>
+              <w:pStyle w:val="Code"/>
+              <w:cnfStyle w:val="000000000000" w:firstRow="0" w:lastRow="0" w:firstColumn="0" w:lastColumn="0" w:oddVBand="0" w:evenVBand="0" w:oddHBand="0" w:evenHBand="0" w:firstRowFirstColumn="0" w:firstRowLastColumn="0" w:lastRowFirstColumn="0" w:lastRowLastColumn="0"/>
+            </w:pPr>
+            <w:r>
+              <w:t>5 bits = /24 + 5 = /29</w:t>
+            </w:r>
+          </w:p>
           <w:p>
             <w:pPr>
               <w:pStyle w:val="Code"/>
@@ -17697,6 +17769,36 @@
               <w:pStyle w:val="Code"/>
               <w:cnfStyle w:val="000000100000" w:firstRow="0" w:lastRow="0" w:firstColumn="0" w:lastColumn="0" w:oddVBand="0" w:evenVBand="0" w:oddHBand="1" w:evenHBand="0" w:firstRowFirstColumn="0" w:firstRowLastColumn="0" w:lastRowFirstColumn="0" w:lastRowLastColumn="0"/>
             </w:pPr>
+            <w:r>
+              <w:t>128 – 117 = 11 hotes</w:t>
+            </w:r>
+          </w:p>
+          <w:p>
+            <w:pPr>
+              <w:pStyle w:val="Code"/>
+              <w:cnfStyle w:val="000000100000" w:firstRow="0" w:lastRow="0" w:firstColumn="0" w:lastColumn="0" w:oddVBand="0" w:evenVBand="0" w:oddHBand="1" w:evenHBand="0" w:firstRowFirstColumn="0" w:firstRowLastColumn="0" w:lastRowFirstColumn="0" w:lastRowLastColumn="0"/>
+            </w:pPr>
+            <w:r>
+              <w:t>32 – 23 = 9 hotes</w:t>
+            </w:r>
+          </w:p>
+          <w:p>
+            <w:pPr>
+              <w:pStyle w:val="Code"/>
+              <w:cnfStyle w:val="000000100000" w:firstRow="0" w:lastRow="0" w:firstColumn="0" w:lastColumn="0" w:oddVBand="0" w:evenVBand="0" w:oddHBand="1" w:evenHBand="0" w:firstRowFirstColumn="0" w:firstRowLastColumn="0" w:lastRowFirstColumn="0" w:lastRowLastColumn="0"/>
+            </w:pPr>
+            <w:r>
+              <w:t>16 – 9 = 7 hotes</w:t>
+            </w:r>
+          </w:p>
+          <w:p>
+            <w:pPr>
+              <w:pStyle w:val="Code"/>
+              <w:cnfStyle w:val="000000100000" w:firstRow="0" w:lastRow="0" w:firstColumn="0" w:lastColumn="0" w:oddVBand="0" w:evenVBand="0" w:oddHBand="1" w:evenHBand="0" w:firstRowFirstColumn="0" w:firstRowLastColumn="0" w:lastRowFirstColumn="0" w:lastRowLastColumn="0"/>
+            </w:pPr>
+            <w:r>
+              <w:t>8 – 7 = 1 hotes</w:t>
+            </w:r>
           </w:p>
         </w:tc>
       </w:tr>
@@ -17714,6 +17816,7 @@
               <w:spacing w:before="0"/>
             </w:pPr>
             <w:r>
+              <w:lastRenderedPageBreak/>
               <w:t>Réseaux utilisés</w:t>
             </w:r>
           </w:p>
@@ -17729,6 +17832,36 @@
               <w:pStyle w:val="Code"/>
               <w:cnfStyle w:val="000000000000" w:firstRow="0" w:lastRow="0" w:firstColumn="0" w:lastColumn="0" w:oddVBand="0" w:evenVBand="0" w:oddHBand="0" w:evenHBand="0" w:firstRowFirstColumn="0" w:firstRowLastColumn="0" w:lastRowFirstColumn="0" w:lastRowLastColumn="0"/>
             </w:pPr>
+            <w:r>
+              <w:t>192.168.100.0/25</w:t>
+            </w:r>
+          </w:p>
+          <w:p>
+            <w:pPr>
+              <w:pStyle w:val="Code"/>
+              <w:cnfStyle w:val="000000000000" w:firstRow="0" w:lastRow="0" w:firstColumn="0" w:lastColumn="0" w:oddVBand="0" w:evenVBand="0" w:oddHBand="0" w:evenHBand="0" w:firstRowFirstColumn="0" w:firstRowLastColumn="0" w:lastRowFirstColumn="0" w:lastRowLastColumn="0"/>
+            </w:pPr>
+            <w:r>
+              <w:t>192.168.100.128/27</w:t>
+            </w:r>
+          </w:p>
+          <w:p>
+            <w:pPr>
+              <w:pStyle w:val="Code"/>
+              <w:cnfStyle w:val="000000000000" w:firstRow="0" w:lastRow="0" w:firstColumn="0" w:lastColumn="0" w:oddVBand="0" w:evenVBand="0" w:oddHBand="0" w:evenHBand="0" w:firstRowFirstColumn="0" w:firstRowLastColumn="0" w:lastRowFirstColumn="0" w:lastRowLastColumn="0"/>
+            </w:pPr>
+            <w:r>
+              <w:t>192.168.100.168/28</w:t>
+            </w:r>
+          </w:p>
+          <w:p>
+            <w:pPr>
+              <w:pStyle w:val="Code"/>
+              <w:cnfStyle w:val="000000000000" w:firstRow="0" w:lastRow="0" w:firstColumn="0" w:lastColumn="0" w:oddVBand="0" w:evenVBand="0" w:oddHBand="0" w:evenHBand="0" w:firstRowFirstColumn="0" w:firstRowLastColumn="0" w:lastRowFirstColumn="0" w:lastRowLastColumn="0"/>
+            </w:pPr>
+            <w:r>
+              <w:t>192.168.100.176/29</w:t>
+            </w:r>
           </w:p>
         </w:tc>
       </w:tr>
@@ -17765,6 +17898,42 @@
               <w:pStyle w:val="Code"/>
               <w:cnfStyle w:val="000000100000" w:firstRow="0" w:lastRow="0" w:firstColumn="0" w:lastColumn="0" w:oddVBand="0" w:evenVBand="0" w:oddHBand="1" w:evenHBand="0" w:firstRowFirstColumn="0" w:firstRowLastColumn="0" w:lastRowFirstColumn="0" w:lastRowLastColumn="0"/>
             </w:pPr>
+            <w:r>
+              <w:t>192.168.100.1 – 126</w:t>
+            </w:r>
+          </w:p>
+          <w:p>
+            <w:pPr>
+              <w:pStyle w:val="Code"/>
+              <w:cnfStyle w:val="000000100000" w:firstRow="0" w:lastRow="0" w:firstColumn="0" w:lastColumn="0" w:oddVBand="0" w:evenVBand="0" w:oddHBand="1" w:evenHBand="0" w:firstRowFirstColumn="0" w:firstRowLastColumn="0" w:lastRowFirstColumn="0" w:lastRowLastColumn="0"/>
+            </w:pPr>
+            <w:r>
+              <w:t>192.168.100.129 – 158</w:t>
+            </w:r>
+          </w:p>
+          <w:p>
+            <w:pPr>
+              <w:pStyle w:val="Code"/>
+              <w:cnfStyle w:val="000000100000" w:firstRow="0" w:lastRow="0" w:firstColumn="0" w:lastColumn="0" w:oddVBand="0" w:evenVBand="0" w:oddHBand="1" w:evenHBand="0" w:firstRowFirstColumn="0" w:firstRowLastColumn="0" w:lastRowFirstColumn="0" w:lastRowLastColumn="0"/>
+            </w:pPr>
+            <w:r>
+              <w:t xml:space="preserve">192.168.100.161 </w:t>
+            </w:r>
+            <w:r>
+              <w:t>–</w:t>
+            </w:r>
+            <w:r>
+              <w:t xml:space="preserve"> 174</w:t>
+            </w:r>
+          </w:p>
+          <w:p>
+            <w:pPr>
+              <w:pStyle w:val="Code"/>
+              <w:cnfStyle w:val="000000100000" w:firstRow="0" w:lastRow="0" w:firstColumn="0" w:lastColumn="0" w:oddVBand="0" w:evenVBand="0" w:oddHBand="1" w:evenHBand="0" w:firstRowFirstColumn="0" w:firstRowLastColumn="0" w:lastRowFirstColumn="0" w:lastRowLastColumn="0"/>
+            </w:pPr>
+            <w:r>
+              <w:t>192.168.100.177 - 182</w:t>
+            </w:r>
           </w:p>
         </w:tc>
       </w:tr>
@@ -20877,6 +21046,7 @@
   <w:style w:type="character" w:default="1" w:styleId="Policepardfaut">
     <w:name w:val="Default Paragraph Font"/>
     <w:uiPriority w:val="1"/>
+    <w:semiHidden/>
     <w:unhideWhenUsed/>
   </w:style>
   <w:style w:type="table" w:default="1" w:styleId="TableauNormal">
@@ -22142,21 +22312,15 @@
 </file>
 
 <file path=customXml/item1.xml><?xml version="1.0" encoding="utf-8"?>
-<p:properties xmlns:p="http://schemas.microsoft.com/office/2006/metadata/properties" xmlns:xsi="http://www.w3.org/2001/XMLSchema-instance" xmlns:pc="http://schemas.microsoft.com/office/infopath/2007/PartnerControls">
-  <documentManagement>
-    <TaxCatchAll xmlns="b34e80cf-1934-4719-b55f-e2e975c926d7" xsi:nil="true"/>
-    <lcf76f155ced4ddcb4097134ff3c332f xmlns="3c67b34e-3a70-4c82-a88a-c9ff4020302e">
-      <Terms xmlns="http://schemas.microsoft.com/office/infopath/2007/PartnerControls"/>
-    </lcf76f155ced4ddcb4097134ff3c332f>
-  </documentManagement>
-</p:properties>
+<?mso-contentType ?>
+<FormTemplates xmlns="http://schemas.microsoft.com/sharepoint/v3/contenttype/forms">
+  <Display>DocumentLibraryForm</Display>
+  <Edit>DocumentLibraryForm</Edit>
+  <New>DocumentLibraryForm</New>
+</FormTemplates>
 </file>
 
 <file path=customXml/item2.xml><?xml version="1.0" encoding="utf-8"?>
-<b:Sources xmlns:b="http://schemas.openxmlformats.org/officeDocument/2006/bibliography" xmlns="http://schemas.openxmlformats.org/officeDocument/2006/bibliography" SelectedStyle="\APASixthEditionOfficeOnline.xsl" StyleName="APA" Version="6"/>
-</file>
-
-<file path=customXml/item3.xml><?xml version="1.0" encoding="utf-8"?>
 <ct:contentTypeSchema xmlns:ct="http://schemas.microsoft.com/office/2006/metadata/contentType" xmlns:ma="http://schemas.microsoft.com/office/2006/metadata/properties/metaAttributes" ct:_="" ma:_="" ma:contentTypeName="Document" ma:contentTypeID="0x010100B6EB6CCE8CCD4E4DB985DB752124FB64" ma:contentTypeVersion="10" ma:contentTypeDescription="Crée un document." ma:contentTypeScope="" ma:versionID="b659a35cc065ce33eb26c369abf814fa">
   <xsd:schema xmlns:xsd="http://www.w3.org/2001/XMLSchema" xmlns:xs="http://www.w3.org/2001/XMLSchema" xmlns:p="http://schemas.microsoft.com/office/2006/metadata/properties" xmlns:ns2="3c67b34e-3a70-4c82-a88a-c9ff4020302e" xmlns:ns3="b34e80cf-1934-4719-b55f-e2e975c926d7" targetNamespace="http://schemas.microsoft.com/office/2006/metadata/properties" ma:root="true" ma:fieldsID="c93dd5925414f1ca5912f8992d0a2fab" ns2:_="" ns3:_="">
     <xsd:import namespace="3c67b34e-3a70-4c82-a88a-c9ff4020302e"/>
@@ -22345,35 +22509,30 @@
 </ct:contentTypeSchema>
 </file>
 
+<file path=customXml/item3.xml><?xml version="1.0" encoding="utf-8"?>
+<b:Sources xmlns:b="http://schemas.openxmlformats.org/officeDocument/2006/bibliography" xmlns="http://schemas.openxmlformats.org/officeDocument/2006/bibliography" SelectedStyle="\APASixthEditionOfficeOnline.xsl" StyleName="APA" Version="6"/>
+</file>
+
 <file path=customXml/item4.xml><?xml version="1.0" encoding="utf-8"?>
-<?mso-contentType ?>
-<FormTemplates xmlns="http://schemas.microsoft.com/sharepoint/v3/contenttype/forms">
-  <Display>DocumentLibraryForm</Display>
-  <Edit>DocumentLibraryForm</Edit>
-  <New>DocumentLibraryForm</New>
-</FormTemplates>
+<p:properties xmlns:p="http://schemas.microsoft.com/office/2006/metadata/properties" xmlns:xsi="http://www.w3.org/2001/XMLSchema-instance" xmlns:pc="http://schemas.microsoft.com/office/infopath/2007/PartnerControls">
+  <documentManagement>
+    <TaxCatchAll xmlns="b34e80cf-1934-4719-b55f-e2e975c926d7" xsi:nil="true"/>
+    <lcf76f155ced4ddcb4097134ff3c332f xmlns="3c67b34e-3a70-4c82-a88a-c9ff4020302e">
+      <Terms xmlns="http://schemas.microsoft.com/office/infopath/2007/PartnerControls"/>
+    </lcf76f155ced4ddcb4097134ff3c332f>
+  </documentManagement>
+</p:properties>
 </file>
 
 <file path=customXml/itemProps1.xml><?xml version="1.0" encoding="utf-8"?>
-<ds:datastoreItem xmlns:ds="http://schemas.openxmlformats.org/officeDocument/2006/customXml" ds:itemID="{B1A0529D-107D-48F2-9C7A-C9B0532E61D6}">
+<ds:datastoreItem xmlns:ds="http://schemas.openxmlformats.org/officeDocument/2006/customXml" ds:itemID="{5991A026-0A3A-4A40-9DFB-B1FAB829B1E8}">
   <ds:schemaRefs>
-    <ds:schemaRef ds:uri="http://schemas.microsoft.com/office/2006/metadata/properties"/>
-    <ds:schemaRef ds:uri="http://schemas.microsoft.com/office/infopath/2007/PartnerControls"/>
-    <ds:schemaRef ds:uri="b34e80cf-1934-4719-b55f-e2e975c926d7"/>
-    <ds:schemaRef ds:uri="3c67b34e-3a70-4c82-a88a-c9ff4020302e"/>
+    <ds:schemaRef ds:uri="http://schemas.microsoft.com/sharepoint/v3/contenttype/forms"/>
   </ds:schemaRefs>
 </ds:datastoreItem>
 </file>
 
 <file path=customXml/itemProps2.xml><?xml version="1.0" encoding="utf-8"?>
-<ds:datastoreItem xmlns:ds="http://schemas.openxmlformats.org/officeDocument/2006/customXml" ds:itemID="{20730C14-5559-4816-8D2F-267CB32F4239}">
-  <ds:schemaRefs>
-    <ds:schemaRef ds:uri="http://schemas.openxmlformats.org/officeDocument/2006/bibliography"/>
-  </ds:schemaRefs>
-</ds:datastoreItem>
-</file>
-
-<file path=customXml/itemProps3.xml><?xml version="1.0" encoding="utf-8"?>
 <ds:datastoreItem xmlns:ds="http://schemas.openxmlformats.org/officeDocument/2006/customXml" ds:itemID="{C5AA5C65-6DD8-44D7-80E6-264FE947CA39}">
   <ds:schemaRefs>
     <ds:schemaRef ds:uri="http://schemas.microsoft.com/office/2006/metadata/contentType"/>
@@ -22392,10 +22551,21 @@
 </ds:datastoreItem>
 </file>
 
+<file path=customXml/itemProps3.xml><?xml version="1.0" encoding="utf-8"?>
+<ds:datastoreItem xmlns:ds="http://schemas.openxmlformats.org/officeDocument/2006/customXml" ds:itemID="{20730C14-5559-4816-8D2F-267CB32F4239}">
+  <ds:schemaRefs>
+    <ds:schemaRef ds:uri="http://schemas.openxmlformats.org/officeDocument/2006/bibliography"/>
+  </ds:schemaRefs>
+</ds:datastoreItem>
+</file>
+
 <file path=customXml/itemProps4.xml><?xml version="1.0" encoding="utf-8"?>
-<ds:datastoreItem xmlns:ds="http://schemas.openxmlformats.org/officeDocument/2006/customXml" ds:itemID="{5991A026-0A3A-4A40-9DFB-B1FAB829B1E8}">
+<ds:datastoreItem xmlns:ds="http://schemas.openxmlformats.org/officeDocument/2006/customXml" ds:itemID="{B1A0529D-107D-48F2-9C7A-C9B0532E61D6}">
   <ds:schemaRefs>
-    <ds:schemaRef ds:uri="http://schemas.microsoft.com/sharepoint/v3/contenttype/forms"/>
+    <ds:schemaRef ds:uri="http://schemas.microsoft.com/office/2006/metadata/properties"/>
+    <ds:schemaRef ds:uri="http://schemas.microsoft.com/office/infopath/2007/PartnerControls"/>
+    <ds:schemaRef ds:uri="b34e80cf-1934-4719-b55f-e2e975c926d7"/>
+    <ds:schemaRef ds:uri="3c67b34e-3a70-4c82-a88a-c9ff4020302e"/>
   </ds:schemaRefs>
 </ds:datastoreItem>
 </file>
</xml_diff>